<commit_message>
S05/S11/S13: mazos reparados (el recorte del notebook los dejaba rotos)
Los generadores de .pptx leían hojas de Excel que el recorte del
dataset de negocio (commit 2ffbfe3) había borrado y no generaban
presentación. Recalculadas en frío desde data/ con la misma
metodología de las celdas removidas; citas al notebook corregidas
para no apuntar a celdas inexistentes.

Co-Authored-By: Claude Sonnet 5 <noreply@anthropic.com>
</commit_message>
<xml_diff>
--- a/pregrado/s05/plantillas/comparacion_modelos_regularizacion.docx
+++ b/pregrado/s05/plantillas/comparacion_modelos_regularizacion.docx
@@ -172,40 +172,109 @@
               <w:spacing w:after="0"/>
               <w:jc w:val="center"/>
             </w:pPr>
-            <w:r>
-              <w:drawing>
-                <wp:inline xmlns:a="http://schemas.openxmlformats.org/drawingml/2006/main" xmlns:pic="http://schemas.openxmlformats.org/drawingml/2006/picture">
-                  <wp:extent cx="3429000" cy="640080"/>
-                  <wp:docPr id="1" name="Picture 1"/>
-                  <wp:cNvGraphicFramePr>
-                    <a:graphicFrameLocks noChangeAspect="1"/>
-                  </wp:cNvGraphicFramePr>
-                  <a:graphic>
-                    <a:graphicData uri="http://schemas.openxmlformats.org/drawingml/2006/picture">
-                      <pic:pic>
-                        <pic:nvPicPr>
-                          <pic:cNvPr id="0" name="eq_7c12b140d62f.png"/>
-                          <pic:cNvPicPr/>
-                        </pic:nvPicPr>
-                        <pic:blipFill>
-                          <a:blip r:embed="rId9"/>
-                          <a:stretch>
-                            <a:fillRect/>
-                          </a:stretch>
-                        </pic:blipFill>
-                        <pic:spPr>
-                          <a:xfrm>
-                            <a:off x="0" y="0"/>
-                            <a:ext cx="3429000" cy="640080"/>
-                          </a:xfrm>
-                          <a:prstGeom prst="rect"/>
-                        </pic:spPr>
-                      </pic:pic>
-                    </a:graphicData>
-                  </a:graphic>
-                </wp:inline>
-              </w:drawing>
-            </w:r>
+            <m:oMath>
+              <m:acc>
+                <m:accPr>
+                  <m:chr m:val="̂"/>
+                </m:accPr>
+                <m:e>
+                  <m:r>
+                    <m:t>β</m:t>
+                  </m:r>
+                </m:e>
+              </m:acc>
+              <m:r>
+                <m:t>=</m:t>
+              </m:r>
+              <m:limLow>
+                <m:e>
+                  <m:r>
+                    <m:rPr>
+                      <m:sty m:val="p"/>
+                    </m:rPr>
+                    <m:t>argmin</m:t>
+                  </m:r>
+                </m:e>
+                <m:lim>
+                  <m:r>
+                    <m:t>β</m:t>
+                  </m:r>
+                </m:lim>
+              </m:limLow>
+              <m:nary>
+                <m:naryPr>
+                  <m:chr m:val="∑"/>
+                  <m:limLoc m:val="subSup"/>
+                  <m:grow m:val="1"/>
+                  <m:subHide m:val="off"/>
+                  <m:supHide m:val="off"/>
+                </m:naryPr>
+                <m:sub>
+                  <m:r>
+                    <m:t>i=1</m:t>
+                  </m:r>
+                </m:sub>
+                <m:sup>
+                  <m:r>
+                    <m:t>n</m:t>
+                  </m:r>
+                </m:sup>
+                <m:e>
+                  <m:sSup>
+                    <m:e>
+                      <m:d>
+                        <m:dPr>
+                          <m:sepChr m:val="−"/>
+                        </m:dPr>
+                        <m:e>
+                          <m:sSub>
+                            <m:e>
+                              <m:r>
+                                <m:t>y</m:t>
+                              </m:r>
+                            </m:e>
+                            <m:sub>
+                              <m:r>
+                                <m:t>i</m:t>
+                              </m:r>
+                            </m:sub>
+                          </m:sSub>
+                        </m:e>
+                        <m:e>
+                          <m:sSub>
+                            <m:e>
+                              <m:acc>
+                                <m:accPr>
+                                  <m:chr m:val="̂"/>
+                                </m:accPr>
+                                <m:e>
+                                  <m:r>
+                                    <m:t>y</m:t>
+                                  </m:r>
+                                </m:e>
+                              </m:acc>
+                            </m:e>
+                            <m:sub>
+                              <m:r>
+                                <m:t>i</m:t>
+                              </m:r>
+                            </m:sub>
+                          </m:sSub>
+                        </m:e>
+                      </m:d>
+                    </m:e>
+                    <m:sup>
+                      <m:r>
+                        <m:t>2</m:t>
+                      </m:r>
+                    </m:sup>
+                  </m:sSup>
+                </m:e>
+              </m:nary>
+              <m:r>
+                <m:t>+λP(β)(1)</m:t>
+              </m:r>
+            </m:oMath>
           </w:p>
         </w:tc>
         <w:tc>
@@ -247,114 +316,93 @@
       <w:r>
         <w:t xml:space="preserve">—con el RSS </w:t>
       </w:r>
-      <w:r>
-        <w:drawing>
-          <wp:inline xmlns:a="http://schemas.openxmlformats.org/drawingml/2006/main" xmlns:pic="http://schemas.openxmlformats.org/drawingml/2006/picture">
-            <wp:extent cx="539104" cy="206692"/>
-            <wp:docPr id="2" name="Picture 2"/>
-            <wp:cNvGraphicFramePr>
-              <a:graphicFrameLocks noChangeAspect="1"/>
-            </wp:cNvGraphicFramePr>
-            <a:graphic>
-              <a:graphicData uri="http://schemas.openxmlformats.org/drawingml/2006/picture">
-                <pic:pic>
-                  <pic:nvPicPr>
-                    <pic:cNvPr id="0" name="eq_9ae833e57518.png"/>
-                    <pic:cNvPicPr/>
-                  </pic:nvPicPr>
-                  <pic:blipFill>
-                    <a:blip r:embed="rId10"/>
-                    <a:stretch>
-                      <a:fillRect/>
-                    </a:stretch>
-                  </pic:blipFill>
-                  <pic:spPr>
-                    <a:xfrm>
-                      <a:off x="0" y="0"/>
-                      <a:ext cx="539104" cy="206692"/>
-                    </a:xfrm>
-                    <a:prstGeom prst="rect"/>
-                  </pic:spPr>
-                </pic:pic>
-              </a:graphicData>
-            </a:graphic>
-          </wp:inline>
-        </w:drawing>
-      </w:r>
+      <m:oMath>
+        <m:r>
+          <m:t>=</m:t>
+        </m:r>
+        <m:nary>
+          <m:naryPr>
+            <m:chr m:val="∑"/>
+            <m:limLoc m:val="subSup"/>
+            <m:grow m:val="1"/>
+            <m:subHide m:val="off"/>
+            <m:supHide m:val="on"/>
+          </m:naryPr>
+          <m:sub>
+            <m:r>
+              <m:t>i</m:t>
+            </m:r>
+          </m:sub>
+          <m:sup/>
+          <m:e>
+            <m:r>
+              <m:t>(</m:t>
+            </m:r>
+          </m:e>
+        </m:nary>
+        <m:sSub>
+          <m:e>
+            <m:r>
+              <m:t>y</m:t>
+            </m:r>
+          </m:e>
+          <m:sub>
+            <m:r>
+              <m:t>i</m:t>
+            </m:r>
+          </m:sub>
+        </m:sSub>
+        <m:r>
+          <m:t>−</m:t>
+        </m:r>
+        <m:sSub>
+          <m:e>
+            <m:acc>
+              <m:accPr>
+                <m:chr m:val="̂"/>
+              </m:accPr>
+              <m:e>
+                <m:r>
+                  <m:t>y</m:t>
+                </m:r>
+              </m:e>
+            </m:acc>
+          </m:e>
+          <m:sub>
+            <m:r>
+              <m:t>i</m:t>
+            </m:r>
+          </m:sub>
+        </m:sSub>
+        <m:sSup>
+          <m:e>
+            <m:r>
+              <m:t>)</m:t>
+            </m:r>
+          </m:e>
+          <m:sup>
+            <m:r>
+              <m:t>2</m:t>
+            </m:r>
+          </m:sup>
+        </m:sSup>
+      </m:oMath>
       <w:r>
         <w:t xml:space="preserve"> como error de ajuste y </w:t>
       </w:r>
-      <w:r>
-        <w:drawing>
-          <wp:inline xmlns:a="http://schemas.openxmlformats.org/drawingml/2006/main" xmlns:pic="http://schemas.openxmlformats.org/drawingml/2006/picture">
-            <wp:extent cx="339816" cy="206692"/>
-            <wp:docPr id="3" name="Picture 3"/>
-            <wp:cNvGraphicFramePr>
-              <a:graphicFrameLocks noChangeAspect="1"/>
-            </wp:cNvGraphicFramePr>
-            <a:graphic>
-              <a:graphicData uri="http://schemas.openxmlformats.org/drawingml/2006/picture">
-                <pic:pic>
-                  <pic:nvPicPr>
-                    <pic:cNvPr id="0" name="eq_c0277262c1ad.png"/>
-                    <pic:cNvPicPr/>
-                  </pic:nvPicPr>
-                  <pic:blipFill>
-                    <a:blip r:embed="rId11"/>
-                    <a:stretch>
-                      <a:fillRect/>
-                    </a:stretch>
-                  </pic:blipFill>
-                  <pic:spPr>
-                    <a:xfrm>
-                      <a:off x="0" y="0"/>
-                      <a:ext cx="339816" cy="206692"/>
-                    </a:xfrm>
-                    <a:prstGeom prst="rect"/>
-                  </pic:spPr>
-                </pic:pic>
-              </a:graphicData>
-            </a:graphic>
-          </wp:inline>
-        </w:drawing>
-      </w:r>
+      <m:oMath>
+        <m:r>
+          <m:t>P(β)</m:t>
+        </m:r>
+      </m:oMath>
       <w:r>
         <w:t xml:space="preserve"> como penalización—, acepta algo de sesgo y recorta mucha varianza, y generaliza mejor. Según la forma de la penalización </w:t>
       </w:r>
-      <w:r>
-        <w:drawing>
-          <wp:inline xmlns:a="http://schemas.openxmlformats.org/drawingml/2006/main" xmlns:pic="http://schemas.openxmlformats.org/drawingml/2006/picture">
-            <wp:extent cx="339816" cy="206692"/>
-            <wp:docPr id="4" name="Picture 4"/>
-            <wp:cNvGraphicFramePr>
-              <a:graphicFrameLocks noChangeAspect="1"/>
-            </wp:cNvGraphicFramePr>
-            <a:graphic>
-              <a:graphicData uri="http://schemas.openxmlformats.org/drawingml/2006/picture">
-                <pic:pic>
-                  <pic:nvPicPr>
-                    <pic:cNvPr id="0" name="eq_c0277262c1ad.png"/>
-                    <pic:cNvPicPr/>
-                  </pic:nvPicPr>
-                  <pic:blipFill>
-                    <a:blip r:embed="rId11"/>
-                    <a:stretch>
-                      <a:fillRect/>
-                    </a:stretch>
-                  </pic:blipFill>
-                  <pic:spPr>
-                    <a:xfrm>
-                      <a:off x="0" y="0"/>
-                      <a:ext cx="339816" cy="206692"/>
-                    </a:xfrm>
-                    <a:prstGeom prst="rect"/>
-                  </pic:spPr>
-                </pic:pic>
-              </a:graphicData>
-            </a:graphic>
-          </wp:inline>
-        </w:drawing>
-      </w:r>
+      <m:oMath>
+        <m:r>
+          <m:t>P(β)</m:t>
+        </m:r>
+      </m:oMath>
       <w:r>
         <w:t xml:space="preserve"> en (1) se obtiene </w:t>
       </w:r>
@@ -367,40 +415,45 @@
       <w:r>
         <w:t xml:space="preserve"> (L2, </w:t>
       </w:r>
-      <w:r>
-        <w:drawing>
-          <wp:inline xmlns:a="http://schemas.openxmlformats.org/drawingml/2006/main" xmlns:pic="http://schemas.openxmlformats.org/drawingml/2006/picture">
-            <wp:extent cx="441753" cy="206692"/>
-            <wp:docPr id="5" name="Picture 5"/>
-            <wp:cNvGraphicFramePr>
-              <a:graphicFrameLocks noChangeAspect="1"/>
-            </wp:cNvGraphicFramePr>
-            <a:graphic>
-              <a:graphicData uri="http://schemas.openxmlformats.org/drawingml/2006/picture">
-                <pic:pic>
-                  <pic:nvPicPr>
-                    <pic:cNvPr id="0" name="eq_a7d2365f81b8.png"/>
-                    <pic:cNvPicPr/>
-                  </pic:nvPicPr>
-                  <pic:blipFill>
-                    <a:blip r:embed="rId12"/>
-                    <a:stretch>
-                      <a:fillRect/>
-                    </a:stretch>
-                  </pic:blipFill>
-                  <pic:spPr>
-                    <a:xfrm>
-                      <a:off x="0" y="0"/>
-                      <a:ext cx="441753" cy="206692"/>
-                    </a:xfrm>
-                    <a:prstGeom prst="rect"/>
-                  </pic:spPr>
-                </pic:pic>
-              </a:graphicData>
-            </a:graphic>
-          </wp:inline>
-        </w:drawing>
-      </w:r>
+      <m:oMath>
+        <m:r>
+          <m:t>P(β)=</m:t>
+        </m:r>
+        <m:nary>
+          <m:naryPr>
+            <m:chr m:val="∑"/>
+            <m:limLoc m:val="subSup"/>
+            <m:grow m:val="1"/>
+            <m:subHide m:val="off"/>
+            <m:supHide m:val="on"/>
+          </m:naryPr>
+          <m:sub>
+            <m:r>
+              <m:t>j</m:t>
+            </m:r>
+          </m:sub>
+          <m:sup/>
+          <m:e>
+            <m:sSubSup>
+              <m:e>
+                <m:r>
+                  <m:t>β</m:t>
+                </m:r>
+              </m:e>
+              <m:sub>
+                <m:r>
+                  <m:t>j</m:t>
+                </m:r>
+              </m:sub>
+              <m:sup>
+                <m:r>
+                  <m:t>2</m:t>
+                </m:r>
+              </m:sup>
+            </m:sSubSup>
+          </m:e>
+        </m:nary>
+      </m:oMath>
       <w:r>
         <w:t xml:space="preserve">: contrae todo hacia cero, no elimina), </w:t>
       </w:r>
@@ -413,13 +466,46 @@
       <w:r>
         <w:t xml:space="preserve"> (L1, </w:t>
       </w:r>
-      <w:r>
-        <w:rPr>
-          <w:rFonts w:ascii="Consolas" w:hAnsi="Consolas"/>
-          <w:sz w:val="19"/>
-        </w:rPr>
-        <w:t>P(\beta)=\sum_{j}\lvert\beta_j\rvert</w:t>
-      </w:r>
+      <m:oMath>
+        <m:r>
+          <m:t>P(β)=</m:t>
+        </m:r>
+        <m:nary>
+          <m:naryPr>
+            <m:chr m:val="∑"/>
+            <m:limLoc m:val="subSup"/>
+            <m:grow m:val="1"/>
+            <m:subHide m:val="off"/>
+            <m:supHide m:val="on"/>
+          </m:naryPr>
+          <m:sub>
+            <m:r>
+              <m:t>j</m:t>
+            </m:r>
+          </m:sub>
+          <m:sup/>
+          <m:e>
+            <m:r>
+              <m:t>|</m:t>
+            </m:r>
+          </m:e>
+        </m:nary>
+        <m:sSub>
+          <m:e>
+            <m:r>
+              <m:t>β</m:t>
+            </m:r>
+          </m:e>
+          <m:sub>
+            <m:r>
+              <m:t>j</m:t>
+            </m:r>
+          </m:sub>
+        </m:sSub>
+        <m:r>
+          <m:t>|</m:t>
+        </m:r>
+      </m:oMath>
       <w:r>
         <w:t xml:space="preserve">: contrae Y elimina → selección de variables) o </w:t>
       </w:r>
@@ -500,40 +586,139 @@
               <w:spacing w:after="0"/>
               <w:jc w:val="center"/>
             </w:pPr>
-            <w:r>
-              <w:drawing>
-                <wp:inline xmlns:a="http://schemas.openxmlformats.org/drawingml/2006/main" xmlns:pic="http://schemas.openxmlformats.org/drawingml/2006/picture">
-                  <wp:extent cx="3961014" cy="532014"/>
-                  <wp:docPr id="6" name="Picture 6"/>
-                  <wp:cNvGraphicFramePr>
-                    <a:graphicFrameLocks noChangeAspect="1"/>
-                  </wp:cNvGraphicFramePr>
-                  <a:graphic>
-                    <a:graphicData uri="http://schemas.openxmlformats.org/drawingml/2006/picture">
-                      <pic:pic>
-                        <pic:nvPicPr>
-                          <pic:cNvPr id="0" name="eq_d2f756c3a001.png"/>
-                          <pic:cNvPicPr/>
-                        </pic:nvPicPr>
-                        <pic:blipFill>
-                          <a:blip r:embed="rId13"/>
-                          <a:stretch>
-                            <a:fillRect/>
-                          </a:stretch>
-                        </pic:blipFill>
-                        <pic:spPr>
-                          <a:xfrm>
-                            <a:off x="0" y="0"/>
-                            <a:ext cx="3961014" cy="532014"/>
-                          </a:xfrm>
-                          <a:prstGeom prst="rect"/>
-                        </pic:spPr>
-                      </pic:pic>
-                    </a:graphicData>
-                  </a:graphic>
-                </wp:inline>
-              </w:drawing>
-            </w:r>
+            <m:oMath>
+              <m:r>
+                <m:rPr>
+                  <m:sty m:val="p"/>
+                </m:rPr>
+                <m:t>MSE</m:t>
+              </m:r>
+              <m:r>
+                <m:t>=</m:t>
+              </m:r>
+              <m:f>
+                <m:fPr>
+                  <m:type m:val="bar"/>
+                </m:fPr>
+                <m:num>
+                  <m:r>
+                    <m:t>1</m:t>
+                  </m:r>
+                </m:num>
+                <m:den>
+                  <m:sSub>
+                    <m:e>
+                      <m:r>
+                        <m:t>n</m:t>
+                      </m:r>
+                    </m:e>
+                    <m:sub>
+                      <m:r>
+                        <m:rPr>
+                          <m:sty m:val="p"/>
+                        </m:rPr>
+                        <m:t>test</m:t>
+                      </m:r>
+                    </m:sub>
+                  </m:sSub>
+                </m:den>
+              </m:f>
+              <m:nary>
+                <m:naryPr>
+                  <m:chr m:val="∑"/>
+                  <m:limLoc m:val="subSup"/>
+                  <m:grow m:val="1"/>
+                  <m:subHide m:val="off"/>
+                  <m:supHide m:val="on"/>
+                </m:naryPr>
+                <m:sub>
+                  <m:r>
+                    <m:t>i</m:t>
+                  </m:r>
+                </m:sub>
+                <m:sup/>
+                <m:e>
+                  <m:sSup>
+                    <m:e>
+                      <m:d>
+                        <m:dPr>
+                          <m:sepChr m:val="−"/>
+                        </m:dPr>
+                        <m:e>
+                          <m:sSub>
+                            <m:e>
+                              <m:r>
+                                <m:t>y</m:t>
+                              </m:r>
+                            </m:e>
+                            <m:sub>
+                              <m:r>
+                                <m:t>i</m:t>
+                              </m:r>
+                            </m:sub>
+                          </m:sSub>
+                        </m:e>
+                        <m:e>
+                          <m:sSub>
+                            <m:e>
+                              <m:acc>
+                                <m:accPr>
+                                  <m:chr m:val="̂"/>
+                                </m:accPr>
+                                <m:e>
+                                  <m:r>
+                                    <m:t>y</m:t>
+                                  </m:r>
+                                </m:e>
+                              </m:acc>
+                            </m:e>
+                            <m:sub>
+                              <m:r>
+                                <m:t>i</m:t>
+                              </m:r>
+                            </m:sub>
+                          </m:sSub>
+                        </m:e>
+                      </m:d>
+                    </m:e>
+                    <m:sup>
+                      <m:r>
+                        <m:t>2</m:t>
+                      </m:r>
+                    </m:sup>
+                  </m:sSup>
+                </m:e>
+              </m:nary>
+              <m:r>
+                <m:t>,</m:t>
+              </m:r>
+              <m:r>
+                <m:rPr>
+                  <m:sty m:val="p"/>
+                </m:rPr>
+                <m:t>RMSE</m:t>
+              </m:r>
+              <m:r>
+                <m:t>=</m:t>
+              </m:r>
+              <m:rad>
+                <m:radPr>
+                  <m:degHide m:val="on"/>
+                </m:radPr>
+                <m:deg/>
+                <m:e>
+                  <m:r>
+                    <m:rPr>
+                      <m:sty m:val="p"/>
+                    </m:rPr>
+                    <m:t>MSE</m:t>
+                  </m:r>
+                </m:e>
+              </m:rad>
+              <m:r>
+                <m:t>(2)</m:t>
+              </m:r>
+            </m:oMath>
           </w:p>
         </w:tc>
         <w:tc>
@@ -2666,40 +2851,60 @@
         </w:rPr>
         <w:t xml:space="preserve"> Anotar junto al MSE (2) su desviación (p. ej. </w:t>
       </w:r>
-      <w:r>
-        <w:drawing>
-          <wp:inline xmlns:a="http://schemas.openxmlformats.org/drawingml/2006/main" xmlns:pic="http://schemas.openxmlformats.org/drawingml/2006/picture">
-            <wp:extent cx="733613" cy="206692"/>
-            <wp:docPr id="7" name="Picture 7"/>
-            <wp:cNvGraphicFramePr>
-              <a:graphicFrameLocks noChangeAspect="1"/>
-            </wp:cNvGraphicFramePr>
-            <a:graphic>
-              <a:graphicData uri="http://schemas.openxmlformats.org/drawingml/2006/picture">
-                <pic:pic>
-                  <pic:nvPicPr>
-                    <pic:cNvPr id="0" name="eq_7a5c79ec2804.png"/>
-                    <pic:cNvPicPr/>
-                  </pic:nvPicPr>
-                  <pic:blipFill>
-                    <a:blip r:embed="rId14"/>
-                    <a:stretch>
-                      <a:fillRect/>
-                    </a:stretch>
-                  </pic:blipFill>
-                  <pic:spPr>
-                    <a:xfrm>
-                      <a:off x="0" y="0"/>
-                      <a:ext cx="733613" cy="206692"/>
-                    </a:xfrm>
-                    <a:prstGeom prst="rect"/>
-                  </pic:spPr>
-                </pic:pic>
-              </a:graphicData>
-            </a:graphic>
-          </wp:inline>
-        </w:drawing>
-      </w:r>
+      <m:oMath>
+        <m:r>
+          <m:rPr>
+            <m:sty m:val="p"/>
+          </m:rPr>
+          <m:t>sd</m:t>
+        </m:r>
+        <m:r>
+          <m:t>(</m:t>
+        </m:r>
+        <m:sSubSup>
+          <m:e>
+            <m:r>
+              <m:t>e</m:t>
+            </m:r>
+          </m:e>
+          <m:sub>
+            <m:r>
+              <m:t>i</m:t>
+            </m:r>
+          </m:sub>
+          <m:sup>
+            <m:r>
+              <m:t>2</m:t>
+            </m:r>
+          </m:sup>
+        </m:sSubSup>
+        <m:r>
+          <m:t>)/</m:t>
+        </m:r>
+        <m:rad>
+          <m:radPr>
+            <m:degHide m:val="on"/>
+          </m:radPr>
+          <m:deg/>
+          <m:e>
+            <m:sSub>
+              <m:e>
+                <m:r>
+                  <m:t>n</m:t>
+                </m:r>
+              </m:e>
+              <m:sub>
+                <m:r>
+                  <m:rPr>
+                    <m:sty m:val="p"/>
+                  </m:rPr>
+                  <m:t>test</m:t>
+                </m:r>
+              </m:sub>
+            </m:sSub>
+          </m:e>
+        </m:rad>
+      </m:oMath>
       <w:r>
         <w:rPr>
           <w:color w:val="2D2D2D"/>
@@ -3116,13 +3321,54 @@
       <w:r>
         <w:t xml:space="preserve"> (marcar, porque invierte la lectura de "más/menos regularización"): [ ] λ [ ] log(λ) [ ] </w:t>
       </w:r>
-      <w:r>
-        <w:rPr>
-          <w:rFonts w:ascii="Consolas" w:hAnsi="Consolas"/>
-          <w:sz w:val="19"/>
-        </w:rPr>
-        <w:t>s = t/\sum_{j}\lvert\beta_j^{\mathrm{OLS}}\rvert</w:t>
-      </w:r>
+      <m:oMath>
+        <m:r>
+          <m:t>s=t/</m:t>
+        </m:r>
+        <m:nary>
+          <m:naryPr>
+            <m:chr m:val="∑"/>
+            <m:limLoc m:val="subSup"/>
+            <m:grow m:val="1"/>
+            <m:subHide m:val="off"/>
+            <m:supHide m:val="on"/>
+          </m:naryPr>
+          <m:sub>
+            <m:r>
+              <m:t>j</m:t>
+            </m:r>
+          </m:sub>
+          <m:sup/>
+          <m:e>
+            <m:r>
+              <m:t>|</m:t>
+            </m:r>
+          </m:e>
+        </m:nary>
+        <m:sSubSup>
+          <m:e>
+            <m:r>
+              <m:t>β</m:t>
+            </m:r>
+          </m:e>
+          <m:sub>
+            <m:r>
+              <m:t>j</m:t>
+            </m:r>
+          </m:sub>
+          <m:sup>
+            <m:r>
+              <m:rPr>
+                <m:sty m:val="p"/>
+              </m:rPr>
+              <m:t>OLS</m:t>
+            </m:r>
+          </m:sup>
+        </m:sSubSup>
+        <m:r>
+          <m:t>|</m:t>
+        </m:r>
+      </m:oMath>
     </w:p>
     <w:p>
       <w:pPr>
@@ -3289,40 +3535,37 @@
       <w:r>
         <w:t xml:space="preserve"> (donde </w:t>
       </w:r>
-      <w:r>
-        <w:drawing>
-          <wp:inline xmlns:a="http://schemas.openxmlformats.org/drawingml/2006/main" xmlns:pic="http://schemas.openxmlformats.org/drawingml/2006/picture">
-            <wp:extent cx="622946" cy="206692"/>
-            <wp:docPr id="8" name="Picture 8"/>
-            <wp:cNvGraphicFramePr>
-              <a:graphicFrameLocks noChangeAspect="1"/>
-            </wp:cNvGraphicFramePr>
-            <a:graphic>
-              <a:graphicData uri="http://schemas.openxmlformats.org/drawingml/2006/picture">
-                <pic:pic>
-                  <pic:nvPicPr>
-                    <pic:cNvPr id="0" name="eq_491f0304e046.png"/>
-                    <pic:cNvPicPr/>
-                  </pic:nvPicPr>
-                  <pic:blipFill>
-                    <a:blip r:embed="rId15"/>
-                    <a:stretch>
-                      <a:fillRect/>
-                    </a:stretch>
-                  </pic:blipFill>
-                  <pic:spPr>
-                    <a:xfrm>
-                      <a:off x="0" y="0"/>
-                      <a:ext cx="622946" cy="206692"/>
-                    </a:xfrm>
-                    <a:prstGeom prst="rect"/>
-                  </pic:spPr>
-                </pic:pic>
-              </a:graphicData>
-            </a:graphic>
-          </wp:inline>
-        </w:drawing>
-      </w:r>
+      <m:oMath>
+        <m:r>
+          <m:rPr>
+            <m:sty m:val="p"/>
+          </m:rPr>
+          <m:t>se</m:t>
+        </m:r>
+        <m:r>
+          <m:t>=</m:t>
+        </m:r>
+        <m:r>
+          <m:rPr>
+            <m:sty m:val="p"/>
+          </m:rPr>
+          <m:t>sd</m:t>
+        </m:r>
+        <m:r>
+          <m:t>/</m:t>
+        </m:r>
+        <m:rad>
+          <m:radPr>
+            <m:degHide m:val="on"/>
+          </m:radPr>
+          <m:deg/>
+          <m:e>
+            <m:r>
+              <m:t>k</m:t>
+            </m:r>
+          </m:e>
+        </m:rad>
+      </m:oMath>
       <w:r>
         <w:t xml:space="preserve"> es el </w:t>
       </w:r>
@@ -3676,43 +3919,37 @@
               </w:rPr>
               <w:t xml:space="preserve"> (</w:t>
             </w:r>
-            <w:r>
-              <w:rPr>
-                <w:sz w:val="19"/>
-              </w:rPr>
-              <w:drawing>
-                <wp:inline xmlns:a="http://schemas.openxmlformats.org/drawingml/2006/main" xmlns:pic="http://schemas.openxmlformats.org/drawingml/2006/picture">
-                  <wp:extent cx="622946" cy="206692"/>
-                  <wp:docPr id="9" name="Picture 9"/>
-                  <wp:cNvGraphicFramePr>
-                    <a:graphicFrameLocks noChangeAspect="1"/>
-                  </wp:cNvGraphicFramePr>
-                  <a:graphic>
-                    <a:graphicData uri="http://schemas.openxmlformats.org/drawingml/2006/picture">
-                      <pic:pic>
-                        <pic:nvPicPr>
-                          <pic:cNvPr id="0" name="eq_491f0304e046.png"/>
-                          <pic:cNvPicPr/>
-                        </pic:nvPicPr>
-                        <pic:blipFill>
-                          <a:blip r:embed="rId15"/>
-                          <a:stretch>
-                            <a:fillRect/>
-                          </a:stretch>
-                        </pic:blipFill>
-                        <pic:spPr>
-                          <a:xfrm>
-                            <a:off x="0" y="0"/>
-                            <a:ext cx="622946" cy="206692"/>
-                          </a:xfrm>
-                          <a:prstGeom prst="rect"/>
-                        </pic:spPr>
-                      </pic:pic>
-                    </a:graphicData>
-                  </a:graphic>
-                </wp:inline>
-              </w:drawing>
-            </w:r>
+            <m:oMath>
+              <m:r>
+                <m:rPr>
+                  <m:sty m:val="p"/>
+                </m:rPr>
+                <m:t>se</m:t>
+              </m:r>
+              <m:r>
+                <m:t>=</m:t>
+              </m:r>
+              <m:r>
+                <m:rPr>
+                  <m:sty m:val="p"/>
+                </m:rPr>
+                <m:t>sd</m:t>
+              </m:r>
+              <m:r>
+                <m:t>/</m:t>
+              </m:r>
+              <m:rad>
+                <m:radPr>
+                  <m:degHide m:val="on"/>
+                </m:radPr>
+                <m:deg/>
+                <m:e>
+                  <m:r>
+                    <m:t>k</m:t>
+                  </m:r>
+                </m:e>
+              </m:rad>
+            </m:oMath>
             <w:r>
               <w:rPr>
                 <w:sz w:val="19"/>
@@ -4573,43 +4810,11 @@
               </w:rPr>
               <w:t xml:space="preserve">Estandarizar con la puntuación z </w:t>
             </w:r>
-            <w:r>
-              <w:rPr>
-                <w:sz w:val="19"/>
-              </w:rPr>
-              <w:drawing>
-                <wp:inline xmlns:a="http://schemas.openxmlformats.org/drawingml/2006/main" xmlns:pic="http://schemas.openxmlformats.org/drawingml/2006/picture">
-                  <wp:extent cx="858841" cy="206692"/>
-                  <wp:docPr id="10" name="Picture 10"/>
-                  <wp:cNvGraphicFramePr>
-                    <a:graphicFrameLocks noChangeAspect="1"/>
-                  </wp:cNvGraphicFramePr>
-                  <a:graphic>
-                    <a:graphicData uri="http://schemas.openxmlformats.org/drawingml/2006/picture">
-                      <pic:pic>
-                        <pic:nvPicPr>
-                          <pic:cNvPr id="0" name="eq_85c76b0ef8de.png"/>
-                          <pic:cNvPicPr/>
-                        </pic:nvPicPr>
-                        <pic:blipFill>
-                          <a:blip r:embed="rId16"/>
-                          <a:stretch>
-                            <a:fillRect/>
-                          </a:stretch>
-                        </pic:blipFill>
-                        <pic:spPr>
-                          <a:xfrm>
-                            <a:off x="0" y="0"/>
-                            <a:ext cx="858841" cy="206692"/>
-                          </a:xfrm>
-                          <a:prstGeom prst="rect"/>
-                        </pic:spPr>
-                      </pic:pic>
-                    </a:graphicData>
-                  </a:graphic>
-                </wp:inline>
-              </w:drawing>
-            </w:r>
+            <m:oMath>
+              <m:r>
+                <m:t>z=(x−μ)/σ</m:t>
+              </m:r>
+            </m:oMath>
             <w:r>
               <w:rPr>
                 <w:sz w:val="19"/>
@@ -4816,43 +5021,45 @@
               </w:rPr>
               <w:t xml:space="preserve"> (1) con </w:t>
             </w:r>
-            <w:r>
-              <w:rPr>
-                <w:sz w:val="19"/>
-              </w:rPr>
-              <w:drawing>
-                <wp:inline xmlns:a="http://schemas.openxmlformats.org/drawingml/2006/main" xmlns:pic="http://schemas.openxmlformats.org/drawingml/2006/picture">
-                  <wp:extent cx="441753" cy="206692"/>
-                  <wp:docPr id="11" name="Picture 11"/>
-                  <wp:cNvGraphicFramePr>
-                    <a:graphicFrameLocks noChangeAspect="1"/>
-                  </wp:cNvGraphicFramePr>
-                  <a:graphic>
-                    <a:graphicData uri="http://schemas.openxmlformats.org/drawingml/2006/picture">
-                      <pic:pic>
-                        <pic:nvPicPr>
-                          <pic:cNvPr id="0" name="eq_167c25225379.png"/>
-                          <pic:cNvPicPr/>
-                        </pic:nvPicPr>
-                        <pic:blipFill>
-                          <a:blip r:embed="rId17"/>
-                          <a:stretch>
-                            <a:fillRect/>
-                          </a:stretch>
-                        </pic:blipFill>
-                        <pic:spPr>
-                          <a:xfrm>
-                            <a:off x="0" y="0"/>
-                            <a:ext cx="441753" cy="206692"/>
-                          </a:xfrm>
-                          <a:prstGeom prst="rect"/>
-                        </pic:spPr>
-                      </pic:pic>
-                    </a:graphicData>
-                  </a:graphic>
-                </wp:inline>
-              </w:drawing>
-            </w:r>
+            <m:oMath>
+              <m:r>
+                <m:t>P(β)=</m:t>
+              </m:r>
+              <m:nary>
+                <m:naryPr>
+                  <m:chr m:val="∑"/>
+                  <m:limLoc m:val="subSup"/>
+                  <m:grow m:val="1"/>
+                  <m:subHide m:val="off"/>
+                  <m:supHide m:val="on"/>
+                </m:naryPr>
+                <m:sub>
+                  <m:r>
+                    <m:t>j</m:t>
+                  </m:r>
+                </m:sub>
+                <m:sup/>
+                <m:e>
+                  <m:sSubSup>
+                    <m:e>
+                      <m:r>
+                        <m:t>β</m:t>
+                      </m:r>
+                    </m:e>
+                    <m:sub>
+                      <m:r>
+                        <m:t>j</m:t>
+                      </m:r>
+                    </m:sub>
+                    <m:sup>
+                      <m:r>
+                        <m:t>2</m:t>
+                      </m:r>
+                    </m:sup>
+                  </m:sSubSup>
+                </m:e>
+              </m:nary>
+            </m:oMath>
             <w:r>
               <w:rPr>
                 <w:sz w:val="19"/>
@@ -4937,43 +5144,37 @@
               </w:rPr>
               <w:t>Curva de CV en forma de U con banda ±1 se (</w:t>
             </w:r>
-            <w:r>
-              <w:rPr>
-                <w:sz w:val="19"/>
-              </w:rPr>
-              <w:drawing>
-                <wp:inline xmlns:a="http://schemas.openxmlformats.org/drawingml/2006/main" xmlns:pic="http://schemas.openxmlformats.org/drawingml/2006/picture">
-                  <wp:extent cx="622946" cy="206692"/>
-                  <wp:docPr id="12" name="Picture 12"/>
-                  <wp:cNvGraphicFramePr>
-                    <a:graphicFrameLocks noChangeAspect="1"/>
-                  </wp:cNvGraphicFramePr>
-                  <a:graphic>
-                    <a:graphicData uri="http://schemas.openxmlformats.org/drawingml/2006/picture">
-                      <pic:pic>
-                        <pic:nvPicPr>
-                          <pic:cNvPr id="0" name="eq_491f0304e046.png"/>
-                          <pic:cNvPicPr/>
-                        </pic:nvPicPr>
-                        <pic:blipFill>
-                          <a:blip r:embed="rId15"/>
-                          <a:stretch>
-                            <a:fillRect/>
-                          </a:stretch>
-                        </pic:blipFill>
-                        <pic:spPr>
-                          <a:xfrm>
-                            <a:off x="0" y="0"/>
-                            <a:ext cx="622946" cy="206692"/>
-                          </a:xfrm>
-                          <a:prstGeom prst="rect"/>
-                        </pic:spPr>
-                      </pic:pic>
-                    </a:graphicData>
-                  </a:graphic>
-                </wp:inline>
-              </w:drawing>
-            </w:r>
+            <m:oMath>
+              <m:r>
+                <m:rPr>
+                  <m:sty m:val="p"/>
+                </m:rPr>
+                <m:t>se</m:t>
+              </m:r>
+              <m:r>
+                <m:t>=</m:t>
+              </m:r>
+              <m:r>
+                <m:rPr>
+                  <m:sty m:val="p"/>
+                </m:rPr>
+                <m:t>sd</m:t>
+              </m:r>
+              <m:r>
+                <m:t>/</m:t>
+              </m:r>
+              <m:rad>
+                <m:radPr>
+                  <m:degHide m:val="on"/>
+                </m:radPr>
+                <m:deg/>
+                <m:e>
+                  <m:r>
+                    <m:t>k</m:t>
+                  </m:r>
+                </m:e>
+              </m:rad>
+            </m:oMath>
             <w:r>
               <w:rPr>
                 <w:sz w:val="19"/>
@@ -7186,8 +7387,8 @@
       </w:r>
     </w:p>
     <w:sectPr>
-      <w:headerReference w:type="default" r:id="rId18"/>
-      <w:footerReference w:type="default" r:id="rId19"/>
+      <w:headerReference w:type="default" r:id="rId9"/>
+      <w:footerReference w:type="default" r:id="rId10"/>
       <w:pgSz w:w="12240" w:h="15840"/>
       <w:pgMar w:top="1134" w:right="1247" w:bottom="1020" w:left="1247" w:header="720" w:footer="720" w:gutter="0"/>
       <w:cols w:space="720"/>

</xml_diff>